<commit_message>
chore: add temporary lock file for thesis report document
</commit_message>
<xml_diff>
--- a/Skripsi/Laporan/Laporan Ujian Sidang Akhir/Laporan_Tugas_Akhir_Fauzi_Noorsyabani_227007042.docx
+++ b/Skripsi/Laporan/Laporan Ujian Sidang Akhir/Laporan_Tugas_Akhir_Fauzi_Noorsyabani_227007042.docx
@@ -25559,58 +25559,34 @@
           <w:p>
             <w:pPr>
               <w:spacing w:line="240" w:lineRule="auto"/>
-              <w:rPr>
-                <w:lang w:val="sv-SE"/>
-              </w:rPr>
             </w:pPr>
             <w:r>
               <w:t xml:space="preserve">        </w:t>
             </w:r>
             <w:r>
-              <w:rPr>
-                <w:lang w:val="sv-SE"/>
-              </w:rPr>
               <w:t xml:space="preserve"># Buka portal </w:t>
             </w:r>
             <w:r>
-              <w:rPr>
-                <w:lang w:val="sv-SE"/>
-              </w:rPr>
               <w:t>PDDikti</w:t>
             </w:r>
           </w:p>
           <w:p>
             <w:pPr>
               <w:spacing w:line="240" w:lineRule="auto"/>
-              <w:rPr>
-                <w:lang w:val="sv-SE"/>
-              </w:rPr>
-            </w:pPr>
-            <w:r>
-              <w:rPr>
-                <w:lang w:val="sv-SE"/>
-              </w:rPr>
+            </w:pPr>
+            <w:r>
               <w:t xml:space="preserve">        driver.get("https://</w:t>
             </w:r>
             <w:r>
-              <w:rPr>
-                <w:lang w:val="sv-SE"/>
-              </w:rPr>
               <w:t>PDDikti</w:t>
             </w:r>
             <w:r>
-              <w:rPr>
-                <w:lang w:val="sv-SE"/>
-              </w:rPr>
               <w:t>.kemdiktisaintek.go.id/perguruan-tinggi")</w:t>
             </w:r>
           </w:p>
           <w:p>
             <w:pPr>
               <w:spacing w:line="240" w:lineRule="auto"/>
-              <w:rPr>
-                <w:lang w:val="sv-SE"/>
-              </w:rPr>
             </w:pPr>
           </w:p>
           <w:p>
@@ -25618,9 +25594,6 @@
               <w:spacing w:line="240" w:lineRule="auto"/>
             </w:pPr>
             <w:r>
-              <w:rPr>
-                <w:lang w:val="sv-SE"/>
-              </w:rPr>
               <w:t xml:space="preserve">        </w:t>
             </w:r>
             <w:r>
@@ -34199,6 +34172,9 @@
       </w:pPr>
       <w:bookmarkStart w:id="101" w:name="_Toc235287790"/>
       <w:r>
+        <w:t xml:space="preserve">  </w:t>
+      </w:r>
+      <w:r>
         <w:rPr>
           <w:lang w:val="sv-SE"/>
         </w:rPr>
@@ -47381,7 +47357,7 @@
           <w:noProof/>
         </w:rPr>
         <w:drawing>
-          <wp:inline distT="0" distB="0" distL="0" distR="0" wp14:anchorId="77B94AD0" wp14:editId="1D60393D">
+          <wp:inline distT="0" distB="0" distL="0" distR="0" wp14:anchorId="77B94AD0" wp14:editId="3FB77A87">
             <wp:extent cx="5039995" cy="3003550"/>
             <wp:effectExtent l="0" t="0" r="8255" b="6350"/>
             <wp:docPr id="398450602" name="Picture 7"/>
@@ -57581,6 +57557,7 @@
     <w:rsid w:val="00B11751"/>
     <w:rsid w:val="00B24985"/>
     <w:rsid w:val="00B47339"/>
+    <w:rsid w:val="00B54A5E"/>
     <w:rsid w:val="00B648BD"/>
     <w:rsid w:val="00BA7DDC"/>
     <w:rsid w:val="00BB6BBA"/>
@@ -57628,6 +57605,7 @@
     <w:rsid w:val="00E720F2"/>
     <w:rsid w:val="00E809BA"/>
     <w:rsid w:val="00E84F09"/>
+    <w:rsid w:val="00EB0BEC"/>
     <w:rsid w:val="00EC0FFD"/>
     <w:rsid w:val="00EC1936"/>
     <w:rsid w:val="00ED26C6"/>

</xml_diff>

<commit_message>
docs: add initial and revised versions of the final thesis report document
</commit_message>
<xml_diff>
--- a/Skripsi/Laporan/Laporan Ujian Sidang Akhir/Laporan_Tugas_Akhir_Fauzi_Noorsyabani_227007042.docx
+++ b/Skripsi/Laporan/Laporan Ujian Sidang Akhir/Laporan_Tugas_Akhir_Fauzi_Noorsyabani_227007042.docx
@@ -2953,7 +2953,43 @@
         <w:rPr>
           <w:lang w:val="sv-SE"/>
         </w:rPr>
-        <w:t>Namun, pelaporan Pangkalan Data Pendidikan Tinggi (PDDikti) masih bersifat statis dan deskriptif, sehingga menyulitkan pimpinan institusi dalam menganalisis tren rasio maupun disparitas antarprogram studi secara mandiri. Penelitian ini mengimplementasikan sistem Business Intelligence (BI) berbasis data warehouse untuk memantau kapasitas akademik di Universitas Siliwangi secara lebih terstruktur. Dengan mengadopsi kerangka Business Intelligence Roadmap, penelitian ini mengonsolidasikan data agregat longitudinal PDDikti periode Ganjil 2023 hingga Ganjil 2025 melalui proses Extract, Transform, Load (ETL). Proses ETL tersebut menghasilkan 201 rekaman bersih yang selanjutnya divisualisasikan secara interaktif melalui Google Looker Studio dengan kapabilitas drill-down, yang diposisikan sebagai bagian dari Decision Support System (DSS). Pada level agregat, rasio institusi Universitas Siliwangi berada dalam batas ambang yang ditetapkan; meskipun demikian, analisis lebih rinci mengidentifikasi tiga program studi rumpun sosial yang melampaui batas rasio nasional (1:45) pada periode-periode tertentu. Sistem BI ini menyajikan informasi kapasitas akademik secara terpusat dan interaktif, sehingga dapat digunakan sebagai alat bantu untuk mengidentifikasi anomali data di balik angka pelaporan agregat.</w:t>
+        <w:t xml:space="preserve">Namun, pelaporan Pangkalan Data Pendidikan Tinggi (PDDikti) masih bersifat statis dan deskriptif, sehingga menyulitkan pimpinan institusi dalam menganalisis tren rasio maupun disparitas antarprogram studi secara mandiri. </w:t>
+      </w:r>
+      <w:r>
+        <w:rPr>
+          <w:lang w:val="sv-SE"/>
+        </w:rPr>
+        <w:t>Penelitian ini mengimplementasikan sistem Business Intelligence berbasis data warehouse untuk mengintegrasikan data agregat PDDikti ke dalam dashboard analitik interaktif yang mendukung pemantauan kapasitas akademik Universitas Siliwangi.</w:t>
+      </w:r>
+      <w:r>
+        <w:rPr>
+          <w:lang w:val="sv-SE"/>
+        </w:rPr>
+        <w:t xml:space="preserve"> </w:t>
+      </w:r>
+      <w:r>
+        <w:rPr>
+          <w:lang w:val="sv-SE"/>
+        </w:rPr>
+        <w:t xml:space="preserve">Dengan mengadopsi kerangka Business Intelligence Roadmap, penelitian ini mengonsolidasikan data agregat longitudinal PDDikti periode Ganjil 2023 hingga Ganjil 2025 melalui proses Extract, Transform, Load (ETL). Proses ETL tersebut menghasilkan 201 rekaman bersih yang selanjutnya divisualisasikan secara interaktif melalui Google Looker Studio dengan kapabilitas drill-down, yang diposisikan sebagai bagian dari Decision Support System (DSS). </w:t>
+      </w:r>
+      <w:r>
+        <w:rPr>
+          <w:lang w:val="sv-SE"/>
+        </w:rPr>
+        <w:t>Hasil analisis menunjukkan bahwa rasio dosen–mahasiswa Universitas Siliwangi secara institusi masih memenuhi ambang batas nasional. Namun, analisis pada tingkat program studi mengidentifikasi tiga program studi rumpun sosial yang melampaui rasio maksimum 1:45 pada periode tertentu sehingga memerlukan perhatian dalam pengelolaan kapasitas akademik.</w:t>
+      </w:r>
+      <w:r>
+        <w:rPr>
+          <w:lang w:val="sv-SE"/>
+        </w:rPr>
+        <w:t xml:space="preserve"> </w:t>
+      </w:r>
+      <w:r>
+        <w:rPr>
+          <w:lang w:val="sv-SE"/>
+        </w:rPr>
+        <w:t>Sistem BI ini menyajikan informasi kapasitas akademik secara terpusat dan interaktif, sehingga dapat digunakan sebagai alat bantu untuk mengidentifikasi anomali data di balik angka pelaporan agregat.</w:t>
       </w:r>
     </w:p>
     <w:p>
@@ -25559,34 +25595,58 @@
           <w:p>
             <w:pPr>
               <w:spacing w:line="240" w:lineRule="auto"/>
+              <w:rPr>
+                <w:lang w:val="sv-SE"/>
+              </w:rPr>
             </w:pPr>
             <w:r>
               <w:t xml:space="preserve">        </w:t>
             </w:r>
             <w:r>
+              <w:rPr>
+                <w:lang w:val="sv-SE"/>
+              </w:rPr>
               <w:t xml:space="preserve"># Buka portal </w:t>
             </w:r>
             <w:r>
+              <w:rPr>
+                <w:lang w:val="sv-SE"/>
+              </w:rPr>
               <w:t>PDDikti</w:t>
             </w:r>
           </w:p>
           <w:p>
             <w:pPr>
               <w:spacing w:line="240" w:lineRule="auto"/>
-            </w:pPr>
-            <w:r>
+              <w:rPr>
+                <w:lang w:val="sv-SE"/>
+              </w:rPr>
+            </w:pPr>
+            <w:r>
+              <w:rPr>
+                <w:lang w:val="sv-SE"/>
+              </w:rPr>
               <w:t xml:space="preserve">        driver.get("https://</w:t>
             </w:r>
             <w:r>
+              <w:rPr>
+                <w:lang w:val="sv-SE"/>
+              </w:rPr>
               <w:t>PDDikti</w:t>
             </w:r>
             <w:r>
+              <w:rPr>
+                <w:lang w:val="sv-SE"/>
+              </w:rPr>
               <w:t>.kemdiktisaintek.go.id/perguruan-tinggi")</w:t>
             </w:r>
           </w:p>
           <w:p>
             <w:pPr>
               <w:spacing w:line="240" w:lineRule="auto"/>
+              <w:rPr>
+                <w:lang w:val="sv-SE"/>
+              </w:rPr>
             </w:pPr>
           </w:p>
           <w:p>
@@ -25594,6 +25654,9 @@
               <w:spacing w:line="240" w:lineRule="auto"/>
             </w:pPr>
             <w:r>
+              <w:rPr>
+                <w:lang w:val="sv-SE"/>
+              </w:rPr>
               <w:t xml:space="preserve">        </w:t>
             </w:r>
             <w:r>
@@ -47357,7 +47420,7 @@
           <w:noProof/>
         </w:rPr>
         <w:drawing>
-          <wp:inline distT="0" distB="0" distL="0" distR="0" wp14:anchorId="77B94AD0" wp14:editId="3FB77A87">
+          <wp:inline distT="0" distB="0" distL="0" distR="0" wp14:anchorId="77B94AD0" wp14:editId="27F35BA5">
             <wp:extent cx="5039995" cy="3003550"/>
             <wp:effectExtent l="0" t="0" r="8255" b="6350"/>
             <wp:docPr id="398450602" name="Picture 7"/>
@@ -55859,7 +55922,6 @@
   <w:style w:type="character" w:default="1" w:styleId="DefaultParagraphFont">
     <w:name w:val="Default Paragraph Font"/>
     <w:uiPriority w:val="1"/>
-    <w:semiHidden/>
     <w:unhideWhenUsed/>
   </w:style>
   <w:style w:type="table" w:default="1" w:styleId="TableNormal">
@@ -57423,6 +57485,7 @@
     <w:rsid w:val="001456A2"/>
     <w:rsid w:val="0014721E"/>
     <w:rsid w:val="001979B0"/>
+    <w:rsid w:val="001B1823"/>
     <w:rsid w:val="001B7B28"/>
     <w:rsid w:val="001D4D63"/>
     <w:rsid w:val="001E2F02"/>
@@ -57478,6 +57541,7 @@
     <w:rsid w:val="005B6D6D"/>
     <w:rsid w:val="005B7B75"/>
     <w:rsid w:val="005D6466"/>
+    <w:rsid w:val="005F17B7"/>
     <w:rsid w:val="0062611E"/>
     <w:rsid w:val="006315DE"/>
     <w:rsid w:val="00647250"/>

</xml_diff>